<commit_message>
#46 Add PDF and Docs file with binaries flesh procedure
</commit_message>
<xml_diff>
--- a/Documents/PlatformIO_Setup_Guide.docx
+++ b/Documents/PlatformIO_Setup_Guide.docx
@@ -573,8 +573,8 @@
         </w:rPr>
       </w:pPr>
       <w:r>
-        <w:object w:dxaOrig="8640" w:dyaOrig="4559">
-          <v:rect xmlns:o="urn:schemas-microsoft-com:office:office" xmlns:v="urn:schemas-microsoft-com:vml" id="rectole0000000000" style="width:432.000000pt;height:227.950000pt" o:preferrelative="t" o:ole="">
+        <w:object w:dxaOrig="8848" w:dyaOrig="4677">
+          <v:rect xmlns:o="urn:schemas-microsoft-com:office:office" xmlns:v="urn:schemas-microsoft-com:vml" id="rectole0000000000" style="width:442.400000pt;height:233.850000pt" o:preferrelative="t" o:ole="">
             <o:lock v:ext="edit"/>
             <v:imagedata xmlns:r="http://schemas.openxmlformats.org/officeDocument/2006/relationships" r:id="docRId2" o:title=""/>
           </v:rect>
@@ -653,8 +653,8 @@
         </w:rPr>
       </w:pPr>
       <w:r>
-        <w:object w:dxaOrig="8640" w:dyaOrig="4529">
-          <v:rect xmlns:o="urn:schemas-microsoft-com:office:office" xmlns:v="urn:schemas-microsoft-com:vml" id="rectole0000000001" style="width:432.000000pt;height:226.450000pt" o:preferrelative="t" o:ole="">
+        <w:object w:dxaOrig="8848" w:dyaOrig="4636">
+          <v:rect xmlns:o="urn:schemas-microsoft-com:office:office" xmlns:v="urn:schemas-microsoft-com:vml" id="rectole0000000001" style="width:442.400000pt;height:231.800000pt" o:preferrelative="t" o:ole="">
             <o:lock v:ext="edit"/>
             <v:imagedata xmlns:r="http://schemas.openxmlformats.org/officeDocument/2006/relationships" r:id="docRId4" o:title=""/>
           </v:rect>
@@ -787,8 +787,8 @@
         </w:rPr>
       </w:pPr>
       <w:r>
-        <w:object w:dxaOrig="8640" w:dyaOrig="4529">
-          <v:rect xmlns:o="urn:schemas-microsoft-com:office:office" xmlns:v="urn:schemas-microsoft-com:vml" id="rectole0000000002" style="width:432.000000pt;height:226.450000pt" o:preferrelative="t" o:ole="">
+        <w:object w:dxaOrig="8848" w:dyaOrig="4636">
+          <v:rect xmlns:o="urn:schemas-microsoft-com:office:office" xmlns:v="urn:schemas-microsoft-com:vml" id="rectole0000000002" style="width:442.400000pt;height:231.800000pt" o:preferrelative="t" o:ole="">
             <o:lock v:ext="edit"/>
             <v:imagedata xmlns:r="http://schemas.openxmlformats.org/officeDocument/2006/relationships" r:id="docRId6" o:title=""/>
           </v:rect>
@@ -943,12 +943,929 @@
         <w:t xml:space="preserve">"upload_port = COM3"</w:t>
       </w:r>
     </w:p>
+    <w:p>
+      <w:pPr>
+        <w:spacing w:before="0" w:after="200" w:line="276"/>
+        <w:ind w:right="0" w:left="0" w:firstLine="0"/>
+        <w:jc w:val="left"/>
+        <w:rPr>
+          <w:rFonts w:ascii="Cambria" w:hAnsi="Cambria" w:cs="Cambria" w:eastAsia="Cambria"/>
+          <w:color w:val="auto"/>
+          <w:spacing w:val="0"/>
+          <w:position w:val="0"/>
+          <w:sz w:val="22"/>
+          <w:shd w:fill="auto" w:val="clear"/>
+        </w:rPr>
+      </w:pPr>
+    </w:p>
+    <w:p>
+      <w:pPr>
+        <w:spacing w:before="0" w:after="200" w:line="276"/>
+        <w:ind w:right="0" w:left="0" w:firstLine="0"/>
+        <w:jc w:val="left"/>
+        <w:rPr>
+          <w:rFonts w:ascii="Cambria" w:hAnsi="Cambria" w:cs="Cambria" w:eastAsia="Cambria"/>
+          <w:color w:val="auto"/>
+          <w:spacing w:val="0"/>
+          <w:position w:val="0"/>
+          <w:sz w:val="22"/>
+          <w:shd w:fill="auto" w:val="clear"/>
+        </w:rPr>
+      </w:pPr>
+      <w:r>
+        <w:rPr>
+          <w:rFonts w:ascii="Calibri" w:hAnsi="Calibri" w:cs="Calibri" w:eastAsia="Calibri"/>
+          <w:b/>
+          <w:color w:val="4F81BD"/>
+          <w:spacing w:val="0"/>
+          <w:position w:val="0"/>
+          <w:sz w:val="28"/>
+          <w:shd w:fill="auto" w:val="clear"/>
+        </w:rPr>
+        <w:t xml:space="preserve">Upload Binaries on ESP32:</w:t>
+      </w:r>
+    </w:p>
+    <w:p>
+      <w:pPr>
+        <w:spacing w:before="0" w:after="200" w:line="276"/>
+        <w:ind w:right="0" w:left="0" w:firstLine="0"/>
+        <w:jc w:val="left"/>
+        <w:rPr>
+          <w:rFonts w:ascii="Cambria" w:hAnsi="Cambria" w:cs="Cambria" w:eastAsia="Cambria"/>
+          <w:color w:val="auto"/>
+          <w:spacing w:val="0"/>
+          <w:position w:val="0"/>
+          <w:sz w:val="22"/>
+          <w:shd w:fill="auto" w:val="clear"/>
+        </w:rPr>
+      </w:pPr>
+      <w:r>
+        <w:rPr>
+          <w:rFonts w:ascii="Cambria" w:hAnsi="Cambria" w:cs="Cambria" w:eastAsia="Cambria"/>
+          <w:color w:val="auto"/>
+          <w:spacing w:val="0"/>
+          <w:position w:val="0"/>
+          <w:sz w:val="22"/>
+          <w:shd w:fill="auto" w:val="clear"/>
+        </w:rPr>
+        <w:t xml:space="preserve">Follow these steps to upload the binary files to the ESP32 through flash_download_tool:</w:t>
+      </w:r>
+    </w:p>
+    <w:p>
+      <w:pPr>
+        <w:keepNext w:val="true"/>
+        <w:keepLines w:val="true"/>
+        <w:spacing w:before="200" w:after="0" w:line="240"/>
+        <w:ind w:right="0" w:left="0" w:firstLine="0"/>
+        <w:jc w:val="left"/>
+        <w:rPr>
+          <w:rFonts w:ascii="Calibri" w:hAnsi="Calibri" w:cs="Calibri" w:eastAsia="Calibri"/>
+          <w:b/>
+          <w:color w:val="4F81BD"/>
+          <w:spacing w:val="0"/>
+          <w:position w:val="0"/>
+          <w:sz w:val="28"/>
+          <w:shd w:fill="auto" w:val="clear"/>
+        </w:rPr>
+      </w:pPr>
+    </w:p>
+    <w:p>
+      <w:pPr>
+        <w:numPr>
+          <w:ilvl w:val="0"/>
+          <w:numId w:val="28"/>
+        </w:numPr>
+        <w:spacing w:before="0" w:after="200" w:line="240"/>
+        <w:ind w:right="0" w:left="720" w:hanging="480"/>
+        <w:jc w:val="left"/>
+        <w:rPr>
+          <w:rFonts w:ascii="Cambria" w:hAnsi="Cambria" w:cs="Cambria" w:eastAsia="Cambria"/>
+          <w:color w:val="auto"/>
+          <w:spacing w:val="0"/>
+          <w:position w:val="0"/>
+          <w:sz w:val="24"/>
+          <w:shd w:fill="auto" w:val="clear"/>
+        </w:rPr>
+      </w:pPr>
+      <w:r>
+        <w:rPr>
+          <w:rFonts w:ascii="Cambria" w:hAnsi="Cambria" w:cs="Cambria" w:eastAsia="Cambria"/>
+          <w:color w:val="auto"/>
+          <w:spacing w:val="0"/>
+          <w:position w:val="0"/>
+          <w:sz w:val="24"/>
+          <w:shd w:fill="auto" w:val="clear"/>
+        </w:rPr>
+        <w:t xml:space="preserve">Follow these steps to upload the binary files to the ESP32 through </w:t>
+      </w:r>
+      <w:r>
+        <w:rPr>
+          <w:rFonts w:ascii="Consolas" w:hAnsi="Consolas" w:cs="Consolas" w:eastAsia="Consolas"/>
+          <w:color w:val="auto"/>
+          <w:spacing w:val="0"/>
+          <w:position w:val="0"/>
+          <w:sz w:val="22"/>
+          <w:shd w:fill="auto" w:val="clear"/>
+        </w:rPr>
+        <w:t xml:space="preserve">flash_download_tool</w:t>
+      </w:r>
+      <w:r>
+        <w:rPr>
+          <w:rFonts w:ascii="Cambria" w:hAnsi="Cambria" w:cs="Cambria" w:eastAsia="Cambria"/>
+          <w:color w:val="auto"/>
+          <w:spacing w:val="0"/>
+          <w:position w:val="0"/>
+          <w:sz w:val="24"/>
+          <w:shd w:fill="auto" w:val="clear"/>
+        </w:rPr>
+        <w:t xml:space="preserve">: ### Required Software</w:t>
+      </w:r>
+    </w:p>
+    <w:p>
+      <w:pPr>
+        <w:numPr>
+          <w:ilvl w:val="0"/>
+          <w:numId w:val="28"/>
+        </w:numPr>
+        <w:spacing w:before="36" w:after="36" w:line="240"/>
+        <w:ind w:right="0" w:left="720" w:hanging="480"/>
+        <w:jc w:val="left"/>
+        <w:rPr>
+          <w:rFonts w:ascii="Cambria" w:hAnsi="Cambria" w:cs="Cambria" w:eastAsia="Cambria"/>
+          <w:color w:val="auto"/>
+          <w:spacing w:val="0"/>
+          <w:position w:val="0"/>
+          <w:sz w:val="24"/>
+          <w:shd w:fill="auto" w:val="clear"/>
+        </w:rPr>
+      </w:pPr>
+      <w:hyperlink xmlns:r="http://schemas.openxmlformats.org/officeDocument/2006/relationships" r:id="docRId7">
+        <w:r>
+          <w:rPr>
+            <w:rFonts w:ascii="Cambria" w:hAnsi="Cambria" w:cs="Cambria" w:eastAsia="Cambria"/>
+            <w:color w:val="0000FF"/>
+            <w:spacing w:val="0"/>
+            <w:position w:val="0"/>
+            <w:sz w:val="24"/>
+            <w:u w:val="single"/>
+            <w:shd w:fill="auto" w:val="clear"/>
+          </w:rPr>
+          <w:t xml:space="preserve">ESP32 Flash Download Tool</w:t>
+        </w:r>
+      </w:hyperlink>
+    </w:p>
+    <w:p>
+      <w:pPr>
+        <w:keepNext w:val="true"/>
+        <w:keepLines w:val="true"/>
+        <w:spacing w:before="200" w:after="0" w:line="240"/>
+        <w:ind w:right="0" w:left="0" w:firstLine="0"/>
+        <w:jc w:val="left"/>
+        <w:rPr>
+          <w:rFonts w:ascii="Calibri" w:hAnsi="Calibri" w:cs="Calibri" w:eastAsia="Calibri"/>
+          <w:b/>
+          <w:color w:val="4F81BD"/>
+          <w:spacing w:val="0"/>
+          <w:position w:val="0"/>
+          <w:sz w:val="24"/>
+          <w:shd w:fill="auto" w:val="clear"/>
+        </w:rPr>
+      </w:pPr>
+      <w:r>
+        <w:rPr>
+          <w:rFonts w:ascii="Calibri" w:hAnsi="Calibri" w:cs="Calibri" w:eastAsia="Calibri"/>
+          <w:b/>
+          <w:color w:val="4F81BD"/>
+          <w:spacing w:val="0"/>
+          <w:position w:val="0"/>
+          <w:sz w:val="24"/>
+          <w:shd w:fill="auto" w:val="clear"/>
+        </w:rPr>
+        <w:t xml:space="preserve">Testing procedure</w:t>
+      </w:r>
+    </w:p>
+    <w:p>
+      <w:pPr>
+        <w:numPr>
+          <w:ilvl w:val="0"/>
+          <w:numId w:val="31"/>
+        </w:numPr>
+        <w:spacing w:before="0" w:after="200" w:line="240"/>
+        <w:ind w:right="0" w:left="720" w:hanging="480"/>
+        <w:jc w:val="left"/>
+        <w:rPr>
+          <w:rFonts w:ascii="Cambria" w:hAnsi="Cambria" w:cs="Cambria" w:eastAsia="Cambria"/>
+          <w:color w:val="auto"/>
+          <w:spacing w:val="0"/>
+          <w:position w:val="0"/>
+          <w:sz w:val="24"/>
+          <w:shd w:fill="auto" w:val="clear"/>
+        </w:rPr>
+      </w:pPr>
+      <w:r>
+        <w:rPr>
+          <w:rFonts w:ascii="Cambria" w:hAnsi="Cambria" w:cs="Cambria" w:eastAsia="Cambria"/>
+          <w:color w:val="auto"/>
+          <w:spacing w:val="0"/>
+          <w:position w:val="0"/>
+          <w:sz w:val="24"/>
+          <w:shd w:fill="auto" w:val="clear"/>
+        </w:rPr>
+        <w:t xml:space="preserve">Connect the ESP32 Dev Module to the PC via MicroUSB cable.</w:t>
+      </w:r>
+    </w:p>
+    <w:p>
+      <w:pPr>
+        <w:numPr>
+          <w:ilvl w:val="0"/>
+          <w:numId w:val="31"/>
+        </w:numPr>
+        <w:spacing w:before="0" w:after="200" w:line="240"/>
+        <w:ind w:right="0" w:left="720" w:hanging="480"/>
+        <w:jc w:val="left"/>
+        <w:rPr>
+          <w:rFonts w:ascii="Cambria" w:hAnsi="Cambria" w:cs="Cambria" w:eastAsia="Cambria"/>
+          <w:color w:val="auto"/>
+          <w:spacing w:val="0"/>
+          <w:position w:val="0"/>
+          <w:sz w:val="24"/>
+          <w:shd w:fill="auto" w:val="clear"/>
+        </w:rPr>
+      </w:pPr>
+      <w:r>
+        <w:rPr>
+          <w:rFonts w:ascii="Cambria" w:hAnsi="Cambria" w:cs="Cambria" w:eastAsia="Cambria"/>
+          <w:color w:val="auto"/>
+          <w:spacing w:val="0"/>
+          <w:position w:val="0"/>
+          <w:sz w:val="24"/>
+          <w:shd w:fill="auto" w:val="clear"/>
+        </w:rPr>
+        <w:t xml:space="preserve">Open flash download tool and select </w:t>
+      </w:r>
+      <w:r>
+        <w:rPr>
+          <w:rFonts w:ascii="Cambria" w:hAnsi="Cambria" w:cs="Cambria" w:eastAsia="Cambria"/>
+          <w:i/>
+          <w:color w:val="auto"/>
+          <w:spacing w:val="0"/>
+          <w:position w:val="0"/>
+          <w:sz w:val="24"/>
+          <w:shd w:fill="auto" w:val="clear"/>
+        </w:rPr>
+        <w:t xml:space="preserve">Chip Type</w:t>
+      </w:r>
+      <w:r>
+        <w:rPr>
+          <w:rFonts w:ascii="Cambria" w:hAnsi="Cambria" w:cs="Cambria" w:eastAsia="Cambria"/>
+          <w:color w:val="auto"/>
+          <w:spacing w:val="0"/>
+          <w:position w:val="0"/>
+          <w:sz w:val="24"/>
+          <w:shd w:fill="auto" w:val="clear"/>
+        </w:rPr>
+        <w:t xml:space="preserve"> as </w:t>
+      </w:r>
+      <w:r>
+        <w:rPr>
+          <w:rFonts w:ascii="Cambria" w:hAnsi="Cambria" w:cs="Cambria" w:eastAsia="Cambria"/>
+          <w:i/>
+          <w:color w:val="auto"/>
+          <w:spacing w:val="0"/>
+          <w:position w:val="0"/>
+          <w:sz w:val="24"/>
+          <w:shd w:fill="auto" w:val="clear"/>
+        </w:rPr>
+        <w:t xml:space="preserve">ESP32</w:t>
+      </w:r>
+      <w:r>
+        <w:rPr>
+          <w:rFonts w:ascii="Cambria" w:hAnsi="Cambria" w:cs="Cambria" w:eastAsia="Cambria"/>
+          <w:color w:val="auto"/>
+          <w:spacing w:val="0"/>
+          <w:position w:val="0"/>
+          <w:sz w:val="24"/>
+          <w:shd w:fill="auto" w:val="clear"/>
+        </w:rPr>
+        <w:t xml:space="preserve"> and </w:t>
+      </w:r>
+      <w:r>
+        <w:rPr>
+          <w:rFonts w:ascii="Cambria" w:hAnsi="Cambria" w:cs="Cambria" w:eastAsia="Cambria"/>
+          <w:i/>
+          <w:color w:val="auto"/>
+          <w:spacing w:val="0"/>
+          <w:position w:val="0"/>
+          <w:sz w:val="24"/>
+          <w:shd w:fill="auto" w:val="clear"/>
+        </w:rPr>
+        <w:t xml:space="preserve">WorkMode</w:t>
+      </w:r>
+      <w:r>
+        <w:rPr>
+          <w:rFonts w:ascii="Cambria" w:hAnsi="Cambria" w:cs="Cambria" w:eastAsia="Cambria"/>
+          <w:color w:val="auto"/>
+          <w:spacing w:val="0"/>
+          <w:position w:val="0"/>
+          <w:sz w:val="24"/>
+          <w:shd w:fill="auto" w:val="clear"/>
+        </w:rPr>
+        <w:t xml:space="preserve"> as </w:t>
+      </w:r>
+      <w:r>
+        <w:rPr>
+          <w:rFonts w:ascii="Cambria" w:hAnsi="Cambria" w:cs="Cambria" w:eastAsia="Cambria"/>
+          <w:i/>
+          <w:color w:val="auto"/>
+          <w:spacing w:val="0"/>
+          <w:position w:val="0"/>
+          <w:sz w:val="24"/>
+          <w:shd w:fill="auto" w:val="clear"/>
+        </w:rPr>
+        <w:t xml:space="preserve">Develop</w:t>
+      </w:r>
+      <w:r>
+        <w:rPr>
+          <w:rFonts w:ascii="Cambria" w:hAnsi="Cambria" w:cs="Cambria" w:eastAsia="Cambria"/>
+          <w:color w:val="auto"/>
+          <w:spacing w:val="0"/>
+          <w:position w:val="0"/>
+          <w:sz w:val="24"/>
+          <w:shd w:fill="auto" w:val="clear"/>
+        </w:rPr>
+        <w:t xml:space="preserve">. Press </w:t>
+      </w:r>
+      <w:r>
+        <w:rPr>
+          <w:rFonts w:ascii="Cambria" w:hAnsi="Cambria" w:cs="Cambria" w:eastAsia="Cambria"/>
+          <w:i/>
+          <w:color w:val="auto"/>
+          <w:spacing w:val="0"/>
+          <w:position w:val="0"/>
+          <w:sz w:val="24"/>
+          <w:shd w:fill="auto" w:val="clear"/>
+        </w:rPr>
+        <w:t xml:space="preserve">OK</w:t>
+      </w:r>
+      <w:r>
+        <w:rPr>
+          <w:rFonts w:ascii="Cambria" w:hAnsi="Cambria" w:cs="Cambria" w:eastAsia="Cambria"/>
+          <w:color w:val="auto"/>
+          <w:spacing w:val="0"/>
+          <w:position w:val="0"/>
+          <w:sz w:val="24"/>
+          <w:shd w:fill="auto" w:val="clear"/>
+        </w:rPr>
+        <w:t xml:space="preserve"> to move to the next screen.</w:t>
+      </w:r>
+    </w:p>
+    <w:p>
+      <w:pPr>
+        <w:numPr>
+          <w:ilvl w:val="0"/>
+          <w:numId w:val="31"/>
+        </w:numPr>
+        <w:spacing w:before="0" w:after="200" w:line="240"/>
+        <w:ind w:right="0" w:left="720" w:hanging="480"/>
+        <w:jc w:val="left"/>
+        <w:rPr>
+          <w:rFonts w:ascii="Cambria" w:hAnsi="Cambria" w:cs="Cambria" w:eastAsia="Cambria"/>
+          <w:color w:val="auto"/>
+          <w:spacing w:val="0"/>
+          <w:position w:val="0"/>
+          <w:sz w:val="24"/>
+          <w:shd w:fill="auto" w:val="clear"/>
+        </w:rPr>
+      </w:pPr>
+      <w:r>
+        <w:rPr>
+          <w:rFonts w:ascii="Cambria" w:hAnsi="Cambria" w:cs="Cambria" w:eastAsia="Cambria"/>
+          <w:color w:val="auto"/>
+          <w:spacing w:val="0"/>
+          <w:position w:val="0"/>
+          <w:sz w:val="24"/>
+          <w:shd w:fill="auto" w:val="clear"/>
+        </w:rPr>
+        <w:t xml:space="preserve">Select correct </w:t>
+      </w:r>
+      <w:r>
+        <w:rPr>
+          <w:rFonts w:ascii="Cambria" w:hAnsi="Cambria" w:cs="Cambria" w:eastAsia="Cambria"/>
+          <w:i/>
+          <w:color w:val="auto"/>
+          <w:spacing w:val="0"/>
+          <w:position w:val="0"/>
+          <w:sz w:val="24"/>
+          <w:shd w:fill="auto" w:val="clear"/>
+        </w:rPr>
+        <w:t xml:space="preserve">COM Port</w:t>
+      </w:r>
+      <w:r>
+        <w:rPr>
+          <w:rFonts w:ascii="Cambria" w:hAnsi="Cambria" w:cs="Cambria" w:eastAsia="Cambria"/>
+          <w:color w:val="auto"/>
+          <w:spacing w:val="0"/>
+          <w:position w:val="0"/>
+          <w:sz w:val="24"/>
+          <w:shd w:fill="auto" w:val="clear"/>
+        </w:rPr>
+        <w:t xml:space="preserve"> and set </w:t>
+      </w:r>
+      <w:r>
+        <w:rPr>
+          <w:rFonts w:ascii="Cambria" w:hAnsi="Cambria" w:cs="Cambria" w:eastAsia="Cambria"/>
+          <w:i/>
+          <w:color w:val="auto"/>
+          <w:spacing w:val="0"/>
+          <w:position w:val="0"/>
+          <w:sz w:val="24"/>
+          <w:shd w:fill="auto" w:val="clear"/>
+        </w:rPr>
+        <w:t xml:space="preserve">Baud rate</w:t>
+      </w:r>
+      <w:r>
+        <w:rPr>
+          <w:rFonts w:ascii="Cambria" w:hAnsi="Cambria" w:cs="Cambria" w:eastAsia="Cambria"/>
+          <w:color w:val="auto"/>
+          <w:spacing w:val="0"/>
+          <w:position w:val="0"/>
+          <w:sz w:val="24"/>
+          <w:shd w:fill="auto" w:val="clear"/>
+        </w:rPr>
+        <w:t xml:space="preserve"> to </w:t>
+      </w:r>
+      <w:r>
+        <w:rPr>
+          <w:rFonts w:ascii="Cambria" w:hAnsi="Cambria" w:cs="Cambria" w:eastAsia="Cambria"/>
+          <w:i/>
+          <w:color w:val="auto"/>
+          <w:spacing w:val="0"/>
+          <w:position w:val="0"/>
+          <w:sz w:val="24"/>
+          <w:shd w:fill="auto" w:val="clear"/>
+        </w:rPr>
+        <w:t xml:space="preserve">115200</w:t>
+      </w:r>
+      <w:r>
+        <w:rPr>
+          <w:rFonts w:ascii="Cambria" w:hAnsi="Cambria" w:cs="Cambria" w:eastAsia="Cambria"/>
+          <w:color w:val="auto"/>
+          <w:spacing w:val="0"/>
+          <w:position w:val="0"/>
+          <w:sz w:val="24"/>
+          <w:shd w:fill="auto" w:val="clear"/>
+        </w:rPr>
+        <w:t xml:space="preserve"> and then click erase button on new window that opens, to first completely wipe off the ESP32 memory.</w:t>
+      </w:r>
+    </w:p>
+    <w:p>
+      <w:pPr>
+        <w:numPr>
+          <w:ilvl w:val="0"/>
+          <w:numId w:val="31"/>
+        </w:numPr>
+        <w:spacing w:before="0" w:after="200" w:line="240"/>
+        <w:ind w:right="0" w:left="720" w:hanging="480"/>
+        <w:jc w:val="left"/>
+        <w:rPr>
+          <w:rFonts w:ascii="Cambria" w:hAnsi="Cambria" w:cs="Cambria" w:eastAsia="Cambria"/>
+          <w:color w:val="auto"/>
+          <w:spacing w:val="0"/>
+          <w:position w:val="0"/>
+          <w:sz w:val="24"/>
+          <w:shd w:fill="auto" w:val="clear"/>
+        </w:rPr>
+      </w:pPr>
+      <w:r>
+        <w:rPr>
+          <w:rFonts w:ascii="Cambria" w:hAnsi="Cambria" w:cs="Cambria" w:eastAsia="Cambria"/>
+          <w:color w:val="auto"/>
+          <w:spacing w:val="0"/>
+          <w:position w:val="0"/>
+          <w:sz w:val="24"/>
+          <w:shd w:fill="auto" w:val="clear"/>
+        </w:rPr>
+        <w:t xml:space="preserve">Upload the provided binaries as follows:</w:t>
+      </w:r>
+    </w:p>
+    <w:p>
+      <w:pPr>
+        <w:spacing w:before="0" w:after="0" w:line="276"/>
+        <w:ind w:right="0" w:left="0" w:firstLine="0"/>
+        <w:jc w:val="left"/>
+        <w:rPr>
+          <w:rFonts w:ascii="Consolas" w:hAnsi="Consolas" w:cs="Consolas" w:eastAsia="Consolas"/>
+          <w:color w:val="auto"/>
+          <w:spacing w:val="0"/>
+          <w:position w:val="0"/>
+          <w:sz w:val="22"/>
+          <w:shd w:fill="auto" w:val="clear"/>
+        </w:rPr>
+      </w:pPr>
+      <w:r>
+        <w:rPr>
+          <w:rFonts w:ascii="Consolas" w:hAnsi="Consolas" w:cs="Consolas" w:eastAsia="Consolas"/>
+          <w:color w:val="auto"/>
+          <w:spacing w:val="0"/>
+          <w:position w:val="0"/>
+          <w:sz w:val="22"/>
+          <w:shd w:fill="auto" w:val="clear"/>
+        </w:rPr>
+        <w:tab/>
+        <w:t xml:space="preserve">* bootloader.bin  OR  bootloader.bin -&gt; 0x1000</w:t>
+        <w:br/>
+        <w:t xml:space="preserve">      * partitions.bin  OR  partitions.bin -&gt; 0x8000</w:t>
+        <w:br/>
+        <w:t xml:space="preserve">      * firmware.bin    OR  firmware.bin   -&gt; 0x10000</w:t>
+      </w:r>
+    </w:p>
+    <w:p>
+      <w:pPr>
+        <w:spacing w:before="0" w:after="0" w:line="276"/>
+        <w:ind w:right="0" w:left="0" w:firstLine="0"/>
+        <w:jc w:val="left"/>
+        <w:rPr>
+          <w:rFonts w:ascii="Consolas" w:hAnsi="Consolas" w:cs="Consolas" w:eastAsia="Consolas"/>
+          <w:color w:val="auto"/>
+          <w:spacing w:val="0"/>
+          <w:position w:val="0"/>
+          <w:sz w:val="22"/>
+          <w:shd w:fill="auto" w:val="clear"/>
+        </w:rPr>
+      </w:pPr>
+      <w:r>
+        <w:rPr>
+          <w:rFonts w:ascii="Consolas" w:hAnsi="Consolas" w:cs="Consolas" w:eastAsia="Consolas"/>
+          <w:color w:val="auto"/>
+          <w:spacing w:val="0"/>
+          <w:position w:val="0"/>
+          <w:sz w:val="22"/>
+          <w:shd w:fill="auto" w:val="clear"/>
+        </w:rPr>
+        <w:tab/>
+        <w:t xml:space="preserve">* </w:t>
+      </w:r>
+      <w:r>
+        <w:rPr>
+          <w:rFonts w:ascii="Consolas" w:hAnsi="Consolas" w:cs="Consolas" w:eastAsia="Consolas"/>
+          <w:color w:val="auto"/>
+          <w:spacing w:val="0"/>
+          <w:position w:val="0"/>
+          <w:sz w:val="22"/>
+          <w:shd w:fill="auto" w:val="clear"/>
+        </w:rPr>
+        <w:t xml:space="preserve">spiffs.bin</w:t>
+      </w:r>
+      <w:r>
+        <w:rPr>
+          <w:rFonts w:ascii="Consolas" w:hAnsi="Consolas" w:cs="Consolas" w:eastAsia="Consolas"/>
+          <w:color w:val="auto"/>
+          <w:spacing w:val="0"/>
+          <w:position w:val="0"/>
+          <w:sz w:val="22"/>
+          <w:shd w:fill="auto" w:val="clear"/>
+        </w:rPr>
+        <w:t xml:space="preserve">      OR   spiffs.bin   -&gt; 0x310000</w:t>
+      </w:r>
+    </w:p>
+    <w:p>
+      <w:pPr>
+        <w:spacing w:before="0" w:after="200" w:line="240"/>
+        <w:ind w:right="0" w:left="0" w:firstLine="0"/>
+        <w:jc w:val="left"/>
+        <w:rPr>
+          <w:rFonts w:ascii="Consolas" w:hAnsi="Consolas" w:cs="Consolas" w:eastAsia="Consolas"/>
+          <w:color w:val="auto"/>
+          <w:spacing w:val="0"/>
+          <w:position w:val="0"/>
+          <w:sz w:val="22"/>
+          <w:shd w:fill="auto" w:val="clear"/>
+        </w:rPr>
+      </w:pPr>
+    </w:p>
+    <w:p>
+      <w:pPr>
+        <w:numPr>
+          <w:ilvl w:val="0"/>
+          <w:numId w:val="34"/>
+        </w:numPr>
+        <w:spacing w:before="0" w:after="200" w:line="240"/>
+        <w:ind w:right="0" w:left="720" w:hanging="480"/>
+        <w:jc w:val="left"/>
+        <w:rPr>
+          <w:rFonts w:ascii="Cambria" w:hAnsi="Cambria" w:cs="Cambria" w:eastAsia="Cambria"/>
+          <w:color w:val="auto"/>
+          <w:spacing w:val="0"/>
+          <w:position w:val="0"/>
+          <w:sz w:val="24"/>
+          <w:shd w:fill="auto" w:val="clear"/>
+        </w:rPr>
+      </w:pPr>
+      <w:r>
+        <w:rPr>
+          <w:rFonts w:ascii="Cambria" w:hAnsi="Cambria" w:cs="Cambria" w:eastAsia="Cambria"/>
+          <w:color w:val="auto"/>
+          <w:spacing w:val="0"/>
+          <w:position w:val="0"/>
+          <w:sz w:val="24"/>
+          <w:shd w:fill="auto" w:val="clear"/>
+        </w:rPr>
+        <w:t xml:space="preserve">Press the start button to start the flashing process.</w:t>
+      </w:r>
+    </w:p>
+    <w:p>
+      <w:pPr>
+        <w:numPr>
+          <w:ilvl w:val="0"/>
+          <w:numId w:val="34"/>
+        </w:numPr>
+        <w:spacing w:before="0" w:after="200" w:line="240"/>
+        <w:ind w:right="0" w:left="720" w:hanging="480"/>
+        <w:jc w:val="left"/>
+        <w:rPr>
+          <w:rFonts w:ascii="Cambria" w:hAnsi="Cambria" w:cs="Cambria" w:eastAsia="Cambria"/>
+          <w:color w:val="auto"/>
+          <w:spacing w:val="0"/>
+          <w:position w:val="0"/>
+          <w:sz w:val="24"/>
+          <w:shd w:fill="auto" w:val="clear"/>
+        </w:rPr>
+      </w:pPr>
+      <w:r>
+        <w:rPr>
+          <w:rFonts w:ascii="Cambria" w:hAnsi="Cambria" w:cs="Cambria" w:eastAsia="Cambria"/>
+          <w:color w:val="auto"/>
+          <w:spacing w:val="0"/>
+          <w:position w:val="0"/>
+          <w:sz w:val="24"/>
+          <w:shd w:fill="auto" w:val="clear"/>
+        </w:rPr>
+        <w:t xml:space="preserve">Once finished, close the software and reset the ESP32 using EN button on the Dev Module. For the custom board, you can power cycle the board (turning power ON/OFF)</w:t>
+      </w:r>
+    </w:p>
+    <w:p>
+      <w:pPr>
+        <w:numPr>
+          <w:ilvl w:val="0"/>
+          <w:numId w:val="34"/>
+        </w:numPr>
+        <w:spacing w:before="0" w:after="200" w:line="240"/>
+        <w:ind w:right="0" w:left="720" w:hanging="480"/>
+        <w:jc w:val="left"/>
+        <w:rPr>
+          <w:rFonts w:ascii="Cambria" w:hAnsi="Cambria" w:cs="Cambria" w:eastAsia="Cambria"/>
+          <w:color w:val="auto"/>
+          <w:spacing w:val="0"/>
+          <w:position w:val="0"/>
+          <w:sz w:val="24"/>
+          <w:shd w:fill="auto" w:val="clear"/>
+        </w:rPr>
+      </w:pPr>
+      <w:r>
+        <w:rPr>
+          <w:rFonts w:ascii="Cambria" w:hAnsi="Cambria" w:cs="Cambria" w:eastAsia="Cambria"/>
+          <w:color w:val="auto"/>
+          <w:spacing w:val="0"/>
+          <w:position w:val="0"/>
+          <w:sz w:val="24"/>
+          <w:shd w:fill="auto" w:val="clear"/>
+        </w:rPr>
+        <w:t xml:space="preserve">Open termite serial terminal and connect to ESP32 serial port at baud rate of 115200 in order to observe console log.</w:t>
+      </w:r>
+    </w:p>
+    <w:p>
+      <w:pPr>
+        <w:numPr>
+          <w:ilvl w:val="0"/>
+          <w:numId w:val="34"/>
+        </w:numPr>
+        <w:spacing w:before="0" w:after="200" w:line="240"/>
+        <w:ind w:right="0" w:left="720" w:hanging="480"/>
+        <w:jc w:val="left"/>
+        <w:rPr>
+          <w:rFonts w:ascii="Cambria" w:hAnsi="Cambria" w:cs="Cambria" w:eastAsia="Cambria"/>
+          <w:color w:val="auto"/>
+          <w:spacing w:val="0"/>
+          <w:position w:val="0"/>
+          <w:sz w:val="24"/>
+          <w:shd w:fill="auto" w:val="clear"/>
+        </w:rPr>
+      </w:pPr>
+      <w:r>
+        <w:rPr>
+          <w:rFonts w:ascii="Cambria" w:hAnsi="Cambria" w:cs="Cambria" w:eastAsia="Cambria"/>
+          <w:color w:val="auto"/>
+          <w:spacing w:val="0"/>
+          <w:position w:val="0"/>
+          <w:sz w:val="24"/>
+          <w:shd w:fill="auto" w:val="clear"/>
+        </w:rPr>
+        <w:t xml:space="preserve">The ESP32 will first go into WiFi mode and search its memory for stored WiFi credentials, failing to find any, it will fallback to BLE mode.</w:t>
+      </w:r>
+    </w:p>
+    <w:p>
+      <w:pPr>
+        <w:numPr>
+          <w:ilvl w:val="0"/>
+          <w:numId w:val="34"/>
+        </w:numPr>
+        <w:spacing w:before="0" w:after="200" w:line="240"/>
+        <w:ind w:right="0" w:left="720" w:hanging="480"/>
+        <w:jc w:val="left"/>
+        <w:rPr>
+          <w:rFonts w:ascii="Cambria" w:hAnsi="Cambria" w:cs="Cambria" w:eastAsia="Cambria"/>
+          <w:color w:val="auto"/>
+          <w:spacing w:val="0"/>
+          <w:position w:val="0"/>
+          <w:sz w:val="24"/>
+          <w:shd w:fill="auto" w:val="clear"/>
+        </w:rPr>
+      </w:pPr>
+      <w:r>
+        <w:rPr>
+          <w:rFonts w:ascii="Cambria" w:hAnsi="Cambria" w:cs="Cambria" w:eastAsia="Cambria"/>
+          <w:color w:val="auto"/>
+          <w:spacing w:val="0"/>
+          <w:position w:val="0"/>
+          <w:sz w:val="24"/>
+          <w:shd w:fill="auto" w:val="clear"/>
+        </w:rPr>
+        <w:t xml:space="preserve">Supply the WiFi credentials using Smart Masjid App or alternatively nRF Connect app at READ characteristic in JSON format as below:</w:t>
+        <w:br/>
+        <w:t xml:space="preserve">{ “ssid”:“string”, “pass”:“string”, “masjid_id”:“string” }</w:t>
+      </w:r>
+    </w:p>
+    <w:p>
+      <w:pPr>
+        <w:numPr>
+          <w:ilvl w:val="0"/>
+          <w:numId w:val="34"/>
+        </w:numPr>
+        <w:spacing w:before="0" w:after="200" w:line="240"/>
+        <w:ind w:right="0" w:left="720" w:hanging="480"/>
+        <w:jc w:val="left"/>
+        <w:rPr>
+          <w:rFonts w:ascii="Cambria" w:hAnsi="Cambria" w:cs="Cambria" w:eastAsia="Cambria"/>
+          <w:color w:val="auto"/>
+          <w:spacing w:val="0"/>
+          <w:position w:val="0"/>
+          <w:sz w:val="24"/>
+          <w:shd w:fill="auto" w:val="clear"/>
+        </w:rPr>
+      </w:pPr>
+      <w:r>
+        <w:rPr>
+          <w:rFonts w:ascii="Cambria" w:hAnsi="Cambria" w:cs="Cambria" w:eastAsia="Cambria"/>
+          <w:color w:val="auto"/>
+          <w:spacing w:val="0"/>
+          <w:position w:val="0"/>
+          <w:sz w:val="24"/>
+          <w:shd w:fill="auto" w:val="clear"/>
+        </w:rPr>
+        <w:t xml:space="preserve">After receiving, the device will initiate connection to internet and after successful connection, it will hit an API to tell the cloud its online and save provided credentials in EEPROM (permanent memory)</w:t>
+      </w:r>
+    </w:p>
+    <w:p>
+      <w:pPr>
+        <w:numPr>
+          <w:ilvl w:val="0"/>
+          <w:numId w:val="34"/>
+        </w:numPr>
+        <w:spacing w:before="0" w:after="200" w:line="240"/>
+        <w:ind w:right="0" w:left="720" w:hanging="480"/>
+        <w:jc w:val="left"/>
+        <w:rPr>
+          <w:rFonts w:ascii="Cambria" w:hAnsi="Cambria" w:cs="Cambria" w:eastAsia="Cambria"/>
+          <w:color w:val="auto"/>
+          <w:spacing w:val="0"/>
+          <w:position w:val="0"/>
+          <w:sz w:val="24"/>
+          <w:shd w:fill="auto" w:val="clear"/>
+        </w:rPr>
+      </w:pPr>
+      <w:r>
+        <w:rPr>
+          <w:rFonts w:ascii="Cambria" w:hAnsi="Cambria" w:cs="Cambria" w:eastAsia="Cambria"/>
+          <w:color w:val="auto"/>
+          <w:spacing w:val="0"/>
+          <w:position w:val="0"/>
+          <w:sz w:val="24"/>
+          <w:shd w:fill="auto" w:val="clear"/>
+        </w:rPr>
+        <w:t xml:space="preserve">For another cycle of testing, repeat all the above steps.</w:t>
+      </w:r>
+    </w:p>
+    <w:p>
+      <w:pPr>
+        <w:numPr>
+          <w:ilvl w:val="0"/>
+          <w:numId w:val="34"/>
+        </w:numPr>
+        <w:spacing w:before="0" w:after="200" w:line="240"/>
+        <w:ind w:right="0" w:left="720" w:hanging="480"/>
+        <w:jc w:val="left"/>
+        <w:rPr>
+          <w:rFonts w:ascii="Cambria" w:hAnsi="Cambria" w:cs="Cambria" w:eastAsia="Cambria"/>
+          <w:color w:val="auto"/>
+          <w:spacing w:val="0"/>
+          <w:position w:val="0"/>
+          <w:sz w:val="24"/>
+          <w:shd w:fill="auto" w:val="clear"/>
+        </w:rPr>
+      </w:pPr>
+      <w:r>
+        <w:rPr>
+          <w:rFonts w:ascii="Cambria" w:hAnsi="Cambria" w:cs="Cambria" w:eastAsia="Cambria"/>
+          <w:color w:val="auto"/>
+          <w:spacing w:val="0"/>
+          <w:position w:val="0"/>
+          <w:sz w:val="24"/>
+          <w:shd w:fill="auto" w:val="clear"/>
+        </w:rPr>
+        <w:t xml:space="preserve">Demo video link: </w:t>
+      </w:r>
+      <w:hyperlink xmlns:r="http://schemas.openxmlformats.org/officeDocument/2006/relationships" r:id="docRId8">
+        <w:r>
+          <w:rPr>
+            <w:rFonts w:ascii="Cambria" w:hAnsi="Cambria" w:cs="Cambria" w:eastAsia="Cambria"/>
+            <w:color w:val="0000FF"/>
+            <w:spacing w:val="0"/>
+            <w:position w:val="0"/>
+            <w:sz w:val="24"/>
+            <w:u w:val="single"/>
+            <w:shd w:fill="auto" w:val="clear"/>
+          </w:rPr>
+          <w:t xml:space="preserve">Upload Binaries (Demo video</w:t>
+        </w:r>
+      </w:hyperlink>
+    </w:p>
+    <w:p>
+      <w:pPr>
+        <w:spacing w:before="0" w:after="200" w:line="276"/>
+        <w:ind w:right="0" w:left="0" w:firstLine="0"/>
+        <w:jc w:val="left"/>
+        <w:rPr>
+          <w:rFonts w:ascii="Cambria" w:hAnsi="Cambria" w:cs="Cambria" w:eastAsia="Cambria"/>
+          <w:color w:val="auto"/>
+          <w:spacing w:val="0"/>
+          <w:position w:val="0"/>
+          <w:sz w:val="22"/>
+          <w:shd w:fill="auto" w:val="clear"/>
+        </w:rPr>
+      </w:pPr>
+    </w:p>
+    <w:p>
+      <w:pPr>
+        <w:spacing w:before="0" w:after="200" w:line="276"/>
+        <w:ind w:right="0" w:left="0" w:firstLine="0"/>
+        <w:jc w:val="left"/>
+        <w:rPr>
+          <w:rFonts w:ascii="Cambria" w:hAnsi="Cambria" w:cs="Cambria" w:eastAsia="Cambria"/>
+          <w:color w:val="auto"/>
+          <w:spacing w:val="0"/>
+          <w:position w:val="0"/>
+          <w:sz w:val="22"/>
+          <w:shd w:fill="auto" w:val="clear"/>
+        </w:rPr>
+      </w:pPr>
+    </w:p>
   </w:body>
 </w:document>
 </file>
 
 <file path=word/numbering.xml><?xml version="1.0" encoding="utf-8"?>
-<w:numbering xmlns:w="http://schemas.openxmlformats.org/wordprocessingml/2006/main"/>
+<w:numbering xmlns:w="http://schemas.openxmlformats.org/wordprocessingml/2006/main">
+  <w:abstractNum w:abstractNumId="0">
+    <w:lvl w:ilvl="0">
+      <w:start w:val="1"/>
+      <w:numFmt w:val="bullet"/>
+      <w:lvlText w:val="•"/>
+    </w:lvl>
+  </w:abstractNum>
+  <w:abstractNum w:abstractNumId="6">
+    <w:lvl w:ilvl="0">
+      <w:start w:val="1"/>
+      <w:numFmt w:val="bullet"/>
+      <w:lvlText w:val="•"/>
+    </w:lvl>
+  </w:abstractNum>
+  <w:abstractNum w:abstractNumId="12">
+    <w:lvl w:ilvl="0">
+      <w:start w:val="1"/>
+      <w:numFmt w:val="bullet"/>
+      <w:lvlText w:val="•"/>
+    </w:lvl>
+  </w:abstractNum>
+  <w:num w:numId="28">
+    <w:abstractNumId w:val="12"/>
+  </w:num>
+  <w:num w:numId="31">
+    <w:abstractNumId w:val="6"/>
+  </w:num>
+  <w:num w:numId="34">
+    <w:abstractNumId w:val="0"/>
+  </w:num>
+</w:numbering>
 </file>
 
 <file path=word/styles.xml><?xml version="1.0" encoding="utf-8"?>

</xml_diff>